<commit_message>
Polish Valerie Fitzgerald prep: stress-test pass
Soften abusive-marriage framing to her own intake wording in cold open
and FB live copy; make Q2 an explicit rapid-fire callback; add
on-air sensitivity flag.

Co-Authored-By: Claude Opus 4.8 (1M context) <noreply@anthropic.com>
</commit_message>
<xml_diff>
--- a/guest-prep/Valerie_Fitzgerald_Interview_Prep.docx
+++ b/guest-prep/Valerie_Fitzgerald_Interview_Prep.docx
@@ -171,10 +171,10 @@
         <w:rPr>
           <w:b/>
         </w:rPr>
-        <w:t xml:space="preserve">Origin (public, she shares it openly): </w:t>
+        <w:t xml:space="preserve">Origin: </w:t>
       </w:r>
       <w:r>
-        <w:t xml:space="preserve"> Former Ford model (NYC at 19). Fled an abusive marriage, drove to LA with a 3-month-old daughter, sold her modeling jewelry for starting cash. No degree, no business experience.</w:t>
+        <w:t xml:space="preserve"> Former Ford model (NYC at 19). Drove to LA a single mother with a 3-month-old daughter, sold her modeling jewelry for starting cash. No degree, no business experience. (Public record incl. an abusive marriage she left — but in her intake she framed it simply as “single mother.” Let HER decide how deep to go on air; don't lead her there.)</w:t>
       </w:r>
     </w:p>
     <w:p>
@@ -509,7 +509,7 @@
           <w:b w:val="0"/>
           <w:i/>
         </w:rPr>
-        <w:t>“My guest today fled an abusive marriage with a three-month-old baby, sold her modeling jewelry to make rent, and had no degree and no plan — and went on to sell over three billion dollars in real estate. We're going to talk about exactly how she did it. Stay tuned.”</w:t>
+        <w:t>“My guest today arrived in Los Angeles a single mother with a three-month-old, no degree, no plan, and money she raised by selling her own jewelry — and went on to sell over three billion dollars in real estate. We're going to talk about exactly how she did it. Stay tuned.”</w:t>
       </w:r>
     </w:p>
     <w:p>
@@ -985,7 +985,7 @@
           <w:b/>
           <w:sz w:val="23"/>
         </w:rPr>
-        <w:t>2. Your line is ‘be afraid and do it anyway.’ That's a feeling. I want the system underneath it — when the fear was loudest, what did you physically make yourself do that day?</w:t>
+        <w:t>2. You just said it in the rapid fire — ‘be afraid and do it anyway.’ But that's a feeling. I want the system underneath it: when the fear was loudest, what did you physically make yourself do that day?</w:t>
       </w:r>
     </w:p>
     <w:p>
@@ -3288,6 +3288,14 @@
       </w:r>
     </w:p>
     <w:p>
+      <w:pPr>
+        <w:pStyle w:val="ListBullet"/>
+      </w:pPr>
+      <w:r>
+        <w:t>SENSITIVITY: the abusive-marriage detail is public (Heart &amp; Sold, TED) but she framed her intake simply as “single mother.” Cold open and live copy use HER framing. On air: one warm acknowledgment if she raises it, then advance — don't pull her into the trauma she didn't volunteer.</w:t>
+      </w:r>
+    </w:p>
+    <w:p>
       <w:r>
         <w:br w:type="page"/>
       </w:r>
@@ -3325,7 +3333,7 @@
           <w:b w:val="0"/>
           <w:i/>
         </w:rPr>
-        <w:t>LIVE NOW: luxury real estate icon Valerie Fitzgerald joins D.J. Paris on Keeping It Real. She fled an abusive marriage with a newborn, sold her jewelry to make rent, and built a $3 BILLION real estate career. Today she breaks down how to reinvent yourself and rebuild from zero. Drop your questions in the comments!</w:t>
+        <w:t>LIVE NOW: luxury real estate icon Valerie Fitzgerald joins D.J. Paris on Keeping It Real. She arrived in LA a single mother with a newborn, sold her jewelry to make rent, and built a $3 BILLION real estate career. Today she breaks down how to reinvent yourself and rebuild from zero. Drop your questions in the comments!</w:t>
       </w:r>
     </w:p>
     <w:p>

</xml_diff>